<commit_message>
Release v0.17.21 single-deck music workflow
</commit_message>
<xml_diff>
--- a/Documentation/Hazz_Karaoke_Hoster_Complete_Manual.docx
+++ b/Documentation/Hazz_Karaoke_Hoster_Complete_Manual.docx
@@ -31,7 +31,7 @@
         <w:rPr>
           <w:sz w:val="20"/>
         </w:rPr>
-        <w:t>Windows x64  |  Version 0.17.20  |  September 2026</w:t>
+        <w:t>Windows x64  |  Version 0.17.21  |  September 2026</w:t>
       </w:r>
     </w:p>
     <w:p>
@@ -843,7 +843,7 @@
     </w:p>
     <w:p>
       <w:r>
-        <w:t>Press Music and enter an artist or title. Drag results to Deck 1 or Deck 2. Music results appear over the centre so both deck playlists remain visible.</w:t>
+        <w:t>Press Music and enter an artist, title or folder name. Music results appear over the centre so both deck playlists remain visible. Shift-click selects a range and Ctrl-click selects individual tracks. Ctrl+A or Select All selects the complete visible result set. Drag the selection to a deck or press Add to Deck 1 or Add to Deck 2. Tracks are added in displayed order; missing files are marked as broken and skipped.</w:t>
       </w:r>
     </w:p>
     <w:p>
@@ -1011,12 +1011,12 @@
         <w:pStyle w:val="Heading2"/>
       </w:pPr>
       <w:r>
-        <w:t>Pause and stop</w:t>
+        <w:t>Pause and Fade Stop</w:t>
       </w:r>
     </w:p>
     <w:p>
       <w:r>
-        <w:t>Pause resumes from the same position. Stop ends the loaded performance. Starting karaoke stops Music Search quick play and suspends normal background music.</w:t>
+        <w:t>Pause resumes from the same position. Fade Stop lowers karaoke audio smoothly for about 1.5 seconds, then ends the performance and resumes background music. Media errors and shutdown still stop immediately. Starting karaoke stops Music Search quick play and suspends normal background music.</w:t>
       </w:r>
     </w:p>
     <w:p>
@@ -1116,6 +1116,19 @@
     <w:p>
       <w:r>
         <w:t>When Auto Crossfade is enabled, Hazz prepares the other deck and fades near the end of the active track. The Time slider controls the fade length. Fade Now starts the transition immediately. Play Music starts the next scheduled background track after karaoke.</w:t>
+      </w:r>
+    </w:p>
+    <w:p>
+      <w:pPr>
+        <w:pStyle w:val="Heading2"/>
+      </w:pPr>
+      <w:r>
+        <w:t>Single Deck and Side List</w:t>
+      </w:r>
+    </w:p>
+    <w:p>
+      <w:r>
+        <w:t>Choose Show, Single Deck + Side List Mode to use Deck 1 as the only player. Deck 2 becomes a tall holding list and its playback controls are hidden. Add search results, files or saved playlists to the side list, then select one or several tracks and drag them into Deck 1. Deck 1 advances through its own queue automatically. The mode and both lists are restored after restart.</w:t>
       </w:r>
     </w:p>
     <w:p>
@@ -1607,7 +1620,7 @@
       <w:rPr>
         <w:sz w:val="16"/>
       </w:rPr>
-      <w:t>Hazz Karaoke Hoster Complete Manual  |  v0.17.20</w:t>
+      <w:t>Hazz Karaoke Hoster Complete Manual  |  v0.17.21</w:t>
     </w:r>
   </w:p>
 </w:ftr>

</xml_diff>

<commit_message>
Release v0.17.22 with VJ output and precise music controls
</commit_message>
<xml_diff>
--- a/Documentation/Hazz_Karaoke_Hoster_Complete_Manual.docx
+++ b/Documentation/Hazz_Karaoke_Hoster_Complete_Manual.docx
@@ -31,7 +31,7 @@
         <w:rPr>
           <w:sz w:val="20"/>
         </w:rPr>
-        <w:t>Windows x64  |  Version 0.17.21  |  September 2026</w:t>
+        <w:t>Windows x64  |  Version 0.17.22  |  September 2026</w:t>
       </w:r>
     </w:p>
     <w:p>
@@ -1008,6 +1008,15 @@
     </w:p>
     <w:p>
       <w:pPr>
+        <w:pStyle w:val="ListNumber"/>
+        <w:spacing w:after="60"/>
+      </w:pPr>
+      <w:r>
+        <w:t>To load without assigning a singer, drag a Karaoke search result or a supported karaoke file from Windows Explorer directly onto the Karaoke Deck. Hazz loads it without starting playback.</w:t>
+      </w:r>
+    </w:p>
+    <w:p>
+      <w:pPr>
         <w:pStyle w:val="Heading2"/>
       </w:pPr>
       <w:r>
@@ -1016,7 +1025,7 @@
     </w:p>
     <w:p>
       <w:r>
-        <w:t>Pause resumes from the same position. Fade Stop lowers karaoke audio smoothly for about 1.5 seconds, then ends the performance and resumes background music. Media errors and shutdown still stop immediately. Starting karaoke stops Music Search quick play and suspends normal background music.</w:t>
+        <w:t>Pause resumes from the same position. Fade Stop lowers karaoke audio smoothly for 1.5 seconds, then ends the performance and fades the returning background track in over 1.5 seconds. Media errors and shutdown still stop immediately. Starting karaoke stops Music Search quick play and suspends normal background music.</w:t>
       </w:r>
     </w:p>
     <w:p>
@@ -1089,7 +1098,7 @@
     </w:p>
     <w:p>
       <w:r>
-        <w:t>Play starts the selected or scheduled track. Pause, Stop and Shuffle affect that deck. Remove Selected removes unplayed entries without deleting files. Delete performs the same action when the list has focus. The current playing entry is protected.</w:t>
+        <w:t>Play starts the selected or scheduled track. Pause retains the exact position; press Pause again or Play to resume. Drag the timeline slider to seek to an exact point, including while paused. Stop and Shuffle affect that deck. Remove Selected removes unplayed entries without deleting files. Delete performs the same action when the list has focus. The current playing entry is protected.</w:t>
       </w:r>
     </w:p>
     <w:p>
@@ -1128,7 +1137,20 @@
     </w:p>
     <w:p>
       <w:r>
-        <w:t>Choose Show, Single Deck + Side List Mode to use Deck 1 as the only player. Deck 2 becomes a tall holding list and its playback controls are hidden. Add search results, files or saved playlists to the side list, then select one or several tracks and drag them into Deck 1. Deck 1 advances through its own queue automatically. The mode and both lists are restored after restart.</w:t>
+        <w:t>Choose Show, Single Deck + Side List Mode to use Deck 1 as the only player. The complete Deck 2 player is removed and replaced by Add Files, Load List, Save List, Select All, Move Up, Move Down, Send to Deck 1, Shuffle List, Remove Selected and Clear List. Add search results, files or saved playlists to the side list, then drag tracks into Deck 1 or use Send to Deck 1. Deck 1 advances automatically. The mode and both lists are restored after restart.</w:t>
+      </w:r>
+    </w:p>
+    <w:p>
+      <w:pPr>
+        <w:pStyle w:val="Heading2"/>
+      </w:pPr>
+      <w:r>
+        <w:t>VJ music videos</w:t>
+      </w:r>
+    </w:p>
+    <w:p>
+      <w:r>
+        <w:t>Choose Import, Import Music / Video Folders to add video folders. When Deck 1 or Deck 2 plays a video file, Hazz mirrors the picture full-screen to the singer display while keeping that audience copy muted. Play, pause, resume, seek and stop remain synchronized. Karaoke automatically takes priority, and the music video returns when interval music resumes.</w:t>
       </w:r>
     </w:p>
     <w:p>
@@ -1620,7 +1642,7 @@
       <w:rPr>
         <w:sz w:val="16"/>
       </w:rPr>
-      <w:t>Hazz Karaoke Hoster Complete Manual  |  v0.17.21</w:t>
+      <w:t>Hazz Karaoke Hoster Complete Manual  |  v0.17.22</w:t>
     </w:r>
   </w:p>
 </w:ftr>

</xml_diff>

<commit_message>
Release Hazz Karaoke Hoster v0.80
</commit_message>
<xml_diff>
--- a/Documentation/Hazz_Karaoke_Hoster_Complete_Manual.docx
+++ b/Documentation/Hazz_Karaoke_Hoster_Complete_Manual.docx
@@ -14,7 +14,7 @@
       <w:r>
         <w:drawing>
           <wp:inline xmlns:a="http://schemas.openxmlformats.org/drawingml/2006/main" xmlns:pic="http://schemas.openxmlformats.org/drawingml/2006/picture">
-            <wp:extent cx="1645920" cy="763922"/>
+            <wp:extent cx="1234440" cy="572941"/>
             <wp:docPr id="1" name="Picture 1"/>
             <wp:cNvGraphicFramePr>
               <a:graphicFrameLocks noChangeAspect="1"/>
@@ -35,7 +35,7 @@
                   <pic:spPr>
                     <a:xfrm>
                       <a:off x="0" y="0"/>
-                      <a:ext cx="1645920" cy="763922"/>
+                      <a:ext cx="1234440" cy="572941"/>
                     </a:xfrm>
                     <a:prstGeom prst="rect"/>
                   </pic:spPr>
@@ -61,7 +61,7 @@
         <w:jc w:val="center"/>
       </w:pPr>
       <w:r>
-        <w:t>Every screen button workflow and live show function for version 0.17.22</w:t>
+        <w:t>Every screen button workflow and live show function for version 0.80</w:t>
       </w:r>
     </w:p>
     <w:p>
@@ -77,7 +77,7 @@
       <w:r>
         <w:drawing>
           <wp:inline xmlns:a="http://schemas.openxmlformats.org/drawingml/2006/main" xmlns:pic="http://schemas.openxmlformats.org/drawingml/2006/picture">
-            <wp:extent cx="6400800" cy="4520565"/>
+            <wp:extent cx="5760720" cy="4068508"/>
             <wp:docPr id="2" name="Picture 2"/>
             <wp:cNvGraphicFramePr>
               <a:graphicFrameLocks noChangeAspect="1"/>
@@ -98,7 +98,7 @@
                   <pic:spPr>
                     <a:xfrm>
                       <a:off x="0" y="0"/>
-                      <a:ext cx="6400800" cy="4520565"/>
+                      <a:ext cx="5760720" cy="4068508"/>
                     </a:xfrm>
                     <a:prstGeom prst="rect"/>
                   </pic:spPr>
@@ -3861,7 +3861,7 @@
                 <w:b/>
                 <w:sz w:val="18"/>
               </w:rPr>
-              <w:t>Search box</w:t>
+              <w:t>Music Video</w:t>
             </w:r>
           </w:p>
         </w:tc>
@@ -3885,7 +3885,7 @@
                 <w:b w:val="0"/>
                 <w:sz w:val="18"/>
               </w:rPr>
-              <w:t>Searches artist, title, manufacturer, disc ID and indexed folder text as you type.</w:t>
+              <w:t>Searches only video files imported into the music library. It supports the same multi-select and deck actions as Music search.</w:t>
             </w:r>
           </w:p>
         </w:tc>
@@ -3915,7 +3915,7 @@
                 <w:b/>
                 <w:sz w:val="18"/>
               </w:rPr>
-              <w:t>Select All</w:t>
+              <w:t>Search box</w:t>
             </w:r>
           </w:p>
         </w:tc>
@@ -3940,7 +3940,7 @@
                 <w:b w:val="0"/>
                 <w:sz w:val="18"/>
               </w:rPr>
-              <w:t>In Music search, selects every visible result.</w:t>
+              <w:t>Searches artist, title, manufacturer, disc ID and indexed folder text as you type.</w:t>
             </w:r>
           </w:p>
         </w:tc>
@@ -3969,7 +3969,7 @@
                 <w:b/>
                 <w:sz w:val="18"/>
               </w:rPr>
-              <w:t>Add to Deck 1</w:t>
+              <w:t>Select All</w:t>
             </w:r>
           </w:p>
         </w:tc>
@@ -3993,7 +3993,7 @@
                 <w:b w:val="0"/>
                 <w:sz w:val="18"/>
               </w:rPr>
-              <w:t>Adds the selected music result or selected batch to Deck 1.</w:t>
+              <w:t>In Music search, selects every visible result.</w:t>
             </w:r>
           </w:p>
         </w:tc>
@@ -4023,7 +4023,7 @@
                 <w:b/>
                 <w:sz w:val="18"/>
               </w:rPr>
-              <w:t>Add to Deck 2</w:t>
+              <w:t>Add to Deck 1</w:t>
             </w:r>
           </w:p>
         </w:tc>
@@ -4048,7 +4048,7 @@
                 <w:b w:val="0"/>
                 <w:sz w:val="18"/>
               </w:rPr>
-              <w:t>Adds the selected batch to Deck 2, or to the side list in Single Deck mode.</w:t>
+              <w:t>Adds the selected music result or selected batch to Deck 1.</w:t>
             </w:r>
           </w:p>
         </w:tc>
@@ -4077,7 +4077,7 @@
                 <w:b/>
                 <w:sz w:val="18"/>
               </w:rPr>
-              <w:t>Close</w:t>
+              <w:t>Add to Deck 2</w:t>
             </w:r>
           </w:p>
         </w:tc>
@@ -4101,7 +4101,7 @@
                 <w:b w:val="0"/>
                 <w:sz w:val="18"/>
               </w:rPr>
-              <w:t>Closes the results panel without changing queued tracks.</w:t>
+              <w:t>Adds the selected batch to Deck 2, or to the side list in Single Deck mode.</w:t>
             </w:r>
           </w:p>
         </w:tc>
@@ -4131,6 +4131,60 @@
                 <w:b/>
                 <w:sz w:val="18"/>
               </w:rPr>
+              <w:t>Close</w:t>
+            </w:r>
+          </w:p>
+        </w:tc>
+        <w:tc>
+          <w:tcPr>
+            <w:tcW w:type="dxa" w:w="7200"/>
+            <w:vAlign w:val="center"/>
+            <w:tcMar>
+              <w:top w:w="90" w:type="dxa"/>
+              <w:start w:w="100" w:type="dxa"/>
+              <w:bottom w:w="90" w:type="dxa"/>
+              <w:end w:w="100" w:type="dxa"/>
+            </w:tcMar>
+            <w:shd w:fill="F3F7FA"/>
+          </w:tcPr>
+          <w:p>
+            <w:pPr>
+              <w:spacing w:after="0" w:line="240" w:lineRule="auto"/>
+            </w:pPr>
+            <w:r>
+              <w:rPr>
+                <w:b w:val="0"/>
+                <w:sz w:val="18"/>
+              </w:rPr>
+              <w:t>Closes the results panel without changing queued tracks.</w:t>
+            </w:r>
+          </w:p>
+        </w:tc>
+      </w:tr>
+      <w:tr>
+        <w:trPr>
+          <w:cantSplit w:val="true"/>
+        </w:trPr>
+        <w:tc>
+          <w:tcPr>
+            <w:tcW w:type="dxa" w:w="3024"/>
+            <w:vAlign w:val="center"/>
+            <w:tcMar>
+              <w:top w:w="90" w:type="dxa"/>
+              <w:start w:w="100" w:type="dxa"/>
+              <w:bottom w:w="90" w:type="dxa"/>
+              <w:end w:w="100" w:type="dxa"/>
+            </w:tcMar>
+          </w:tcPr>
+          <w:p>
+            <w:pPr>
+              <w:spacing w:after="0" w:line="240" w:lineRule="auto"/>
+            </w:pPr>
+            <w:r>
+              <w:rPr>
+                <w:b/>
+                <w:sz w:val="18"/>
+              </w:rPr>
               <w:t>Cancel Import</w:t>
             </w:r>
           </w:p>
@@ -4145,7 +4199,6 @@
               <w:bottom w:w="90" w:type="dxa"/>
               <w:end w:w="100" w:type="dxa"/>
             </w:tcMar>
-            <w:shd w:fill="F3F7FA"/>
           </w:tcPr>
           <w:p>
             <w:pPr>
@@ -4243,7 +4296,7 @@
     </w:p>
     <w:p>
       <w:r>
-        <w:t>While Music search has focus, press Space to play the highlighted result immediately without adding it to a deck. Press Space again to stop quick play. This is useful for checking a song before adding it to the interval queue.</w:t>
+        <w:t>While Music or Music Video search has focus, press Space to play the highlighted result immediately without adding it to a deck. A quick-played video is also sent to the audience display. Press Space again to stop quick play.</w:t>
       </w:r>
     </w:p>
     <w:p>
@@ -10323,7 +10376,12 @@
     </w:p>
     <w:p>
       <w:r>
-        <w:t>Import music-video folders through Import, Import Music or Video Folders. When Deck 1 or Deck 2 starts a video, Hazz mirrors its picture to the audience display. The audience copy is muted, while the deck supplies the normal show audio.</w:t>
+        <w:t>Import music-video folders through Import, Import Music or Video Folders. Use the Music Video button at the top to search only video files. When Deck 1, Deck 2 or Space-bar quick play starts a video, Hazz mirrors its picture to the audience display. The audience copy is muted, while the player supplies the normal show audio.</w:t>
+      </w:r>
+    </w:p>
+    <w:p>
+      <w:r>
+        <w:t>While a music video is visible, the next-singer list, rotation scroller, venue message, background media and persistent logo are hidden. They return automatically when the video ends, so the picture remains unobstructed.</w:t>
       </w:r>
     </w:p>
     <w:tbl>
@@ -11306,6 +11364,55 @@
         <w:t>Library Browser</w:t>
       </w:r>
     </w:p>
+    <w:p>
+      <w:pPr>
+        <w:spacing w:before="80" w:after="40"/>
+        <w:jc w:val="center"/>
+      </w:pPr>
+      <w:r>
+        <w:drawing>
+          <wp:inline xmlns:a="http://schemas.openxmlformats.org/drawingml/2006/main" xmlns:pic="http://schemas.openxmlformats.org/drawingml/2006/picture">
+            <wp:extent cx="6400800" cy="5760720"/>
+            <wp:docPr id="14" name="Picture 14"/>
+            <wp:cNvGraphicFramePr>
+              <a:graphicFrameLocks noChangeAspect="1"/>
+            </wp:cNvGraphicFramePr>
+            <a:graphic>
+              <a:graphicData uri="http://schemas.openxmlformats.org/drawingml/2006/picture">
+                <pic:pic>
+                  <pic:nvPicPr>
+                    <pic:cNvPr id="0" name="figure_virtual_folders.png"/>
+                    <pic:cNvPicPr/>
+                  </pic:nvPicPr>
+                  <pic:blipFill>
+                    <a:blip r:embed="rId23"/>
+                    <a:stretch>
+                      <a:fillRect/>
+                    </a:stretch>
+                  </pic:blipFill>
+                  <pic:spPr>
+                    <a:xfrm>
+                      <a:off x="0" y="0"/>
+                      <a:ext cx="6400800" cy="5760720"/>
+                    </a:xfrm>
+                    <a:prstGeom prst="rect"/>
+                  </pic:spPr>
+                </pic:pic>
+              </a:graphicData>
+            </a:graphic>
+          </wp:inline>
+        </w:drawing>
+      </w:r>
+    </w:p>
+    <w:p>
+      <w:pPr>
+        <w:pStyle w:val="Caption"/>
+        <w:jc w:val="center"/>
+      </w:pPr>
+      <w:r>
+        <w:t>Figure 14  Virtual folders: organise library links without moving media files</w:t>
+      </w:r>
+    </w:p>
     <w:tbl>
       <w:tblPr>
         <w:tblW w:type="auto" w:w="0"/>
@@ -11866,6 +11973,1138 @@
       <w:pPr>
         <w:spacing w:after="20"/>
       </w:pPr>
+    </w:p>
+    <w:p>
+      <w:pPr>
+        <w:pStyle w:val="Heading2"/>
+        <w:keepNext/>
+      </w:pPr>
+      <w:r>
+        <w:t>Virtual folders: the basic idea</w:t>
+      </w:r>
+    </w:p>
+    <w:p>
+      <w:r>
+        <w:t>Virtual folders are named collections of links to tracks already in the Hazz library. They work like crates or categories: 80s, Rock, Jingles, Requests or any structure you choose. Adding, removing, emptying or deleting a virtual folder never moves or deletes the original audio, video, ZIP or CDG files. One track can belong to several virtual folders.</w:t>
+      </w:r>
+    </w:p>
+    <w:p>
+      <w:pPr>
+        <w:pStyle w:val="Heading2"/>
+        <w:keepNext/>
+      </w:pPr>
+      <w:r>
+        <w:t>Create folders and subfolders</w:t>
+      </w:r>
+    </w:p>
+    <w:p>
+      <w:pPr>
+        <w:ind w:left="259" w:hanging="259"/>
+      </w:pPr>
+      <w:r>
+        <w:rPr>
+          <w:b/>
+          <w:color w:val="173A56"/>
+        </w:rPr>
+        <w:t xml:space="preserve">1. </w:t>
+      </w:r>
+      <w:r>
+        <w:t>Choose Library, Browse Library. The window opens maximised so every folder control is visible.</w:t>
+      </w:r>
+    </w:p>
+    <w:p>
+      <w:pPr>
+        <w:ind w:left="259" w:hanging="259"/>
+      </w:pPr>
+      <w:r>
+        <w:rPr>
+          <w:b/>
+          <w:color w:val="173A56"/>
+        </w:rPr>
+        <w:t xml:space="preserve">2. </w:t>
+      </w:r>
+      <w:r>
+        <w:t>Press New Folder to create a top-level folder such as 80s or Jingles.</w:t>
+      </w:r>
+    </w:p>
+    <w:p>
+      <w:pPr>
+        <w:ind w:left="259" w:hanging="259"/>
+      </w:pPr>
+      <w:r>
+        <w:rPr>
+          <w:b/>
+          <w:color w:val="173A56"/>
+        </w:rPr>
+        <w:t xml:space="preserve">3. </w:t>
+      </w:r>
+      <w:r>
+        <w:t>To create a nested folder, select its intended parent and press New Subfolder. Enter a name such as Rock.</w:t>
+      </w:r>
+    </w:p>
+    <w:p>
+      <w:pPr>
+        <w:ind w:left="259" w:hanging="259"/>
+      </w:pPr>
+      <w:r>
+        <w:rPr>
+          <w:b/>
+          <w:color w:val="173A56"/>
+        </w:rPr>
+        <w:t xml:space="preserve">4. </w:t>
+      </w:r>
+      <w:r>
+        <w:t>Use Rename to change only the selected folder name. The links and media files remain unchanged.</w:t>
+      </w:r>
+    </w:p>
+    <w:p>
+      <w:pPr>
+        <w:pStyle w:val="Heading2"/>
+        <w:keepNext/>
+      </w:pPr>
+      <w:r>
+        <w:t>Add one track or many tracks</w:t>
+      </w:r>
+    </w:p>
+    <w:p>
+      <w:pPr>
+        <w:ind w:left="259" w:hanging="259"/>
+      </w:pPr>
+      <w:r>
+        <w:rPr>
+          <w:b/>
+          <w:color w:val="173A56"/>
+        </w:rPr>
+        <w:t xml:space="preserve">1. </w:t>
+      </w:r>
+      <w:r>
+        <w:t>Select All Library Tracks or the source virtual folder. Choose Karaoke or Music and use the search and sort controls if required.</w:t>
+      </w:r>
+    </w:p>
+    <w:p>
+      <w:pPr>
+        <w:ind w:left="259" w:hanging="259"/>
+      </w:pPr>
+      <w:r>
+        <w:rPr>
+          <w:b/>
+          <w:color w:val="173A56"/>
+        </w:rPr>
+        <w:t xml:space="preserve">2. </w:t>
+      </w:r>
+      <w:r>
+        <w:t>Click one row, Ctrl-click separate rows, Shift-click the first and last rows of a continuous range, or press Ctrl+A to select all visible results.</w:t>
+      </w:r>
+    </w:p>
+    <w:p>
+      <w:pPr>
+        <w:ind w:left="259" w:hanging="259"/>
+      </w:pPr>
+      <w:r>
+        <w:rPr>
+          <w:b/>
+          <w:color w:val="173A56"/>
+        </w:rPr>
+        <w:t xml:space="preserve">3. </w:t>
+      </w:r>
+      <w:r>
+        <w:t>Press Add Selected to Folder. Choose the destination by its full nested path, then press Add Tracks. You may also drag the selected rows directly onto a folder in the left tree.</w:t>
+      </w:r>
+    </w:p>
+    <w:p>
+      <w:pPr>
+        <w:ind w:left="259" w:hanging="259"/>
+      </w:pPr>
+      <w:r>
+        <w:rPr>
+          <w:b/>
+          <w:color w:val="173A56"/>
+        </w:rPr>
+        <w:t xml:space="preserve">4. </w:t>
+      </w:r>
+      <w:r>
+        <w:t>Open the destination folder to check the result. Adding the same track twice does not create a duplicate link.</w:t>
+      </w:r>
+    </w:p>
+    <w:p>
+      <w:pPr>
+        <w:pStyle w:val="Heading2"/>
+        <w:keepNext/>
+      </w:pPr>
+      <w:r>
+        <w:t>Use and maintain a virtual folder</w:t>
+      </w:r>
+    </w:p>
+    <w:tbl>
+      <w:tblPr>
+        <w:tblW w:type="auto" w:w="0"/>
+        <w:jc w:val="center"/>
+        <w:tblLayout w:type="fixed"/>
+        <w:tblLook w:firstColumn="1" w:firstRow="1" w:lastColumn="0" w:lastRow="0" w:noHBand="0" w:noVBand="1" w:val="04A0"/>
+        <w:tblBorders>
+          <w:top w:val="single" w:sz="5" w:color="D9D9D9"/>
+          <w:left w:val="single" w:sz="5" w:color="D9D9D9"/>
+          <w:bottom w:val="single" w:sz="5" w:color="D9D9D9"/>
+          <w:right w:val="single" w:sz="5" w:color="D9D9D9"/>
+          <w:insideH w:val="single" w:sz="5" w:color="D9D9D9"/>
+          <w:insideV w:val="single" w:sz="5" w:color="D9D9D9"/>
+        </w:tblBorders>
+      </w:tblPr>
+      <w:tblGrid>
+        <w:gridCol w:w="5141"/>
+        <w:gridCol w:w="5141"/>
+      </w:tblGrid>
+      <w:tr>
+        <w:trPr>
+          <w:tblHeader w:val="true"/>
+        </w:trPr>
+        <w:tc>
+          <w:tcPr>
+            <w:tcW w:type="dxa" w:w="3024"/>
+            <w:shd w:fill="173A56"/>
+            <w:tcMar>
+              <w:top w:w="90" w:type="dxa"/>
+              <w:start w:w="100" w:type="dxa"/>
+              <w:bottom w:w="90" w:type="dxa"/>
+              <w:end w:w="100" w:type="dxa"/>
+            </w:tcMar>
+            <w:vAlign w:val="center"/>
+          </w:tcPr>
+          <w:p>
+            <w:r>
+              <w:rPr>
+                <w:b/>
+                <w:color w:val="FFFFFF"/>
+                <w:sz w:val="19"/>
+              </w:rPr>
+              <w:t>Control or function</w:t>
+            </w:r>
+          </w:p>
+        </w:tc>
+        <w:tc>
+          <w:tcPr>
+            <w:tcW w:type="dxa" w:w="7200"/>
+            <w:shd w:fill="173A56"/>
+            <w:tcMar>
+              <w:top w:w="90" w:type="dxa"/>
+              <w:start w:w="100" w:type="dxa"/>
+              <w:bottom w:w="90" w:type="dxa"/>
+              <w:end w:w="100" w:type="dxa"/>
+            </w:tcMar>
+            <w:vAlign w:val="center"/>
+          </w:tcPr>
+          <w:p>
+            <w:r>
+              <w:rPr>
+                <w:b/>
+                <w:color w:val="FFFFFF"/>
+                <w:sz w:val="19"/>
+              </w:rPr>
+              <w:t>What it does</w:t>
+            </w:r>
+          </w:p>
+        </w:tc>
+      </w:tr>
+      <w:tr>
+        <w:trPr>
+          <w:cantSplit w:val="true"/>
+        </w:trPr>
+        <w:tc>
+          <w:tcPr>
+            <w:tcW w:type="dxa" w:w="3024"/>
+            <w:vAlign w:val="center"/>
+            <w:tcMar>
+              <w:top w:w="90" w:type="dxa"/>
+              <w:start w:w="100" w:type="dxa"/>
+              <w:bottom w:w="90" w:type="dxa"/>
+              <w:end w:w="100" w:type="dxa"/>
+            </w:tcMar>
+          </w:tcPr>
+          <w:p>
+            <w:pPr>
+              <w:spacing w:after="0" w:line="240" w:lineRule="auto"/>
+            </w:pPr>
+            <w:r>
+              <w:rPr>
+                <w:b/>
+                <w:sz w:val="18"/>
+              </w:rPr>
+              <w:t>All Library Tracks</w:t>
+            </w:r>
+          </w:p>
+        </w:tc>
+        <w:tc>
+          <w:tcPr>
+            <w:tcW w:type="dxa" w:w="7200"/>
+            <w:vAlign w:val="center"/>
+            <w:tcMar>
+              <w:top w:w="90" w:type="dxa"/>
+              <w:start w:w="100" w:type="dxa"/>
+              <w:bottom w:w="90" w:type="dxa"/>
+              <w:end w:w="100" w:type="dxa"/>
+            </w:tcMar>
+          </w:tcPr>
+          <w:p>
+            <w:pPr>
+              <w:spacing w:after="0" w:line="240" w:lineRule="auto"/>
+            </w:pPr>
+            <w:r>
+              <w:rPr>
+                <w:b w:val="0"/>
+                <w:sz w:val="18"/>
+              </w:rPr>
+              <w:t>Returns to the whole indexed library and clears the virtual-folder filter.</w:t>
+            </w:r>
+          </w:p>
+        </w:tc>
+      </w:tr>
+      <w:tr>
+        <w:trPr>
+          <w:cantSplit w:val="true"/>
+        </w:trPr>
+        <w:tc>
+          <w:tcPr>
+            <w:tcW w:type="dxa" w:w="3024"/>
+            <w:vAlign w:val="center"/>
+            <w:tcMar>
+              <w:top w:w="90" w:type="dxa"/>
+              <w:start w:w="100" w:type="dxa"/>
+              <w:bottom w:w="90" w:type="dxa"/>
+              <w:end w:w="100" w:type="dxa"/>
+            </w:tcMar>
+            <w:shd w:fill="F3F7FA"/>
+          </w:tcPr>
+          <w:p>
+            <w:pPr>
+              <w:spacing w:after="0" w:line="240" w:lineRule="auto"/>
+            </w:pPr>
+            <w:r>
+              <w:rPr>
+                <w:b/>
+                <w:sz w:val="18"/>
+              </w:rPr>
+              <w:t>Folder tree</w:t>
+            </w:r>
+          </w:p>
+        </w:tc>
+        <w:tc>
+          <w:tcPr>
+            <w:tcW w:type="dxa" w:w="7200"/>
+            <w:vAlign w:val="center"/>
+            <w:tcMar>
+              <w:top w:w="90" w:type="dxa"/>
+              <w:start w:w="100" w:type="dxa"/>
+              <w:bottom w:w="90" w:type="dxa"/>
+              <w:end w:w="100" w:type="dxa"/>
+            </w:tcMar>
+            <w:shd w:fill="F3F7FA"/>
+          </w:tcPr>
+          <w:p>
+            <w:pPr>
+              <w:spacing w:after="0" w:line="240" w:lineRule="auto"/>
+            </w:pPr>
+            <w:r>
+              <w:rPr>
+                <w:b w:val="0"/>
+                <w:sz w:val="18"/>
+              </w:rPr>
+              <w:t>Selects the active folder. A parent shows its own directly assigned tracks; open a child to see that child collection.</w:t>
+            </w:r>
+          </w:p>
+        </w:tc>
+      </w:tr>
+      <w:tr>
+        <w:trPr>
+          <w:cantSplit w:val="true"/>
+        </w:trPr>
+        <w:tc>
+          <w:tcPr>
+            <w:tcW w:type="dxa" w:w="3024"/>
+            <w:vAlign w:val="center"/>
+            <w:tcMar>
+              <w:top w:w="90" w:type="dxa"/>
+              <w:start w:w="100" w:type="dxa"/>
+              <w:bottom w:w="90" w:type="dxa"/>
+              <w:end w:w="100" w:type="dxa"/>
+            </w:tcMar>
+          </w:tcPr>
+          <w:p>
+            <w:pPr>
+              <w:spacing w:after="0" w:line="240" w:lineRule="auto"/>
+            </w:pPr>
+            <w:r>
+              <w:rPr>
+                <w:b/>
+                <w:sz w:val="18"/>
+              </w:rPr>
+              <w:t>Add Selected to Folder</w:t>
+            </w:r>
+          </w:p>
+        </w:tc>
+        <w:tc>
+          <w:tcPr>
+            <w:tcW w:type="dxa" w:w="7200"/>
+            <w:vAlign w:val="center"/>
+            <w:tcMar>
+              <w:top w:w="90" w:type="dxa"/>
+              <w:start w:w="100" w:type="dxa"/>
+              <w:bottom w:w="90" w:type="dxa"/>
+              <w:end w:w="100" w:type="dxa"/>
+            </w:tcMar>
+          </w:tcPr>
+          <w:p>
+            <w:pPr>
+              <w:spacing w:after="0" w:line="240" w:lineRule="auto"/>
+            </w:pPr>
+            <w:r>
+              <w:rPr>
+                <w:b w:val="0"/>
+                <w:sz w:val="18"/>
+              </w:rPr>
+              <w:t>Opens a destination picker. This is the clearest method for moving a large multi-selection into a nested folder.</w:t>
+            </w:r>
+          </w:p>
+        </w:tc>
+      </w:tr>
+      <w:tr>
+        <w:trPr>
+          <w:cantSplit w:val="true"/>
+        </w:trPr>
+        <w:tc>
+          <w:tcPr>
+            <w:tcW w:type="dxa" w:w="3024"/>
+            <w:vAlign w:val="center"/>
+            <w:tcMar>
+              <w:top w:w="90" w:type="dxa"/>
+              <w:start w:w="100" w:type="dxa"/>
+              <w:bottom w:w="90" w:type="dxa"/>
+              <w:end w:w="100" w:type="dxa"/>
+            </w:tcMar>
+            <w:shd w:fill="F3F7FA"/>
+          </w:tcPr>
+          <w:p>
+            <w:pPr>
+              <w:spacing w:after="0" w:line="240" w:lineRule="auto"/>
+            </w:pPr>
+            <w:r>
+              <w:rPr>
+                <w:b/>
+                <w:sz w:val="18"/>
+              </w:rPr>
+              <w:t>Remove from Folder</w:t>
+            </w:r>
+          </w:p>
+        </w:tc>
+        <w:tc>
+          <w:tcPr>
+            <w:tcW w:type="dxa" w:w="7200"/>
+            <w:vAlign w:val="center"/>
+            <w:tcMar>
+              <w:top w:w="90" w:type="dxa"/>
+              <w:start w:w="100" w:type="dxa"/>
+              <w:bottom w:w="90" w:type="dxa"/>
+              <w:end w:w="100" w:type="dxa"/>
+            </w:tcMar>
+            <w:shd w:fill="F3F7FA"/>
+          </w:tcPr>
+          <w:p>
+            <w:pPr>
+              <w:spacing w:after="0" w:line="240" w:lineRule="auto"/>
+            </w:pPr>
+            <w:r>
+              <w:rPr>
+                <w:b w:val="0"/>
+                <w:sz w:val="18"/>
+              </w:rPr>
+              <w:t>Removes selected links from the open folder. The library entries and files remain.</w:t>
+            </w:r>
+          </w:p>
+        </w:tc>
+      </w:tr>
+      <w:tr>
+        <w:trPr>
+          <w:cantSplit w:val="true"/>
+        </w:trPr>
+        <w:tc>
+          <w:tcPr>
+            <w:tcW w:type="dxa" w:w="3024"/>
+            <w:vAlign w:val="center"/>
+            <w:tcMar>
+              <w:top w:w="90" w:type="dxa"/>
+              <w:start w:w="100" w:type="dxa"/>
+              <w:bottom w:w="90" w:type="dxa"/>
+              <w:end w:w="100" w:type="dxa"/>
+            </w:tcMar>
+          </w:tcPr>
+          <w:p>
+            <w:pPr>
+              <w:spacing w:after="0" w:line="240" w:lineRule="auto"/>
+            </w:pPr>
+            <w:r>
+              <w:rPr>
+                <w:b/>
+                <w:sz w:val="18"/>
+              </w:rPr>
+              <w:t>Empty</w:t>
+            </w:r>
+          </w:p>
+        </w:tc>
+        <w:tc>
+          <w:tcPr>
+            <w:tcW w:type="dxa" w:w="7200"/>
+            <w:vAlign w:val="center"/>
+            <w:tcMar>
+              <w:top w:w="90" w:type="dxa"/>
+              <w:start w:w="100" w:type="dxa"/>
+              <w:bottom w:w="90" w:type="dxa"/>
+              <w:end w:w="100" w:type="dxa"/>
+            </w:tcMar>
+          </w:tcPr>
+          <w:p>
+            <w:pPr>
+              <w:spacing w:after="0" w:line="240" w:lineRule="auto"/>
+            </w:pPr>
+            <w:r>
+              <w:rPr>
+                <w:b w:val="0"/>
+                <w:sz w:val="18"/>
+              </w:rPr>
+              <w:t>Removes every direct track link from the selected folder after confirmation. Subfolders remain.</w:t>
+            </w:r>
+          </w:p>
+        </w:tc>
+      </w:tr>
+      <w:tr>
+        <w:trPr>
+          <w:cantSplit w:val="true"/>
+        </w:trPr>
+        <w:tc>
+          <w:tcPr>
+            <w:tcW w:type="dxa" w:w="3024"/>
+            <w:vAlign w:val="center"/>
+            <w:tcMar>
+              <w:top w:w="90" w:type="dxa"/>
+              <w:start w:w="100" w:type="dxa"/>
+              <w:bottom w:w="90" w:type="dxa"/>
+              <w:end w:w="100" w:type="dxa"/>
+            </w:tcMar>
+            <w:shd w:fill="F3F7FA"/>
+          </w:tcPr>
+          <w:p>
+            <w:pPr>
+              <w:spacing w:after="0" w:line="240" w:lineRule="auto"/>
+            </w:pPr>
+            <w:r>
+              <w:rPr>
+                <w:b/>
+                <w:sz w:val="18"/>
+              </w:rPr>
+              <w:t>Delete Selected Folder</w:t>
+            </w:r>
+          </w:p>
+        </w:tc>
+        <w:tc>
+          <w:tcPr>
+            <w:tcW w:type="dxa" w:w="7200"/>
+            <w:vAlign w:val="center"/>
+            <w:tcMar>
+              <w:top w:w="90" w:type="dxa"/>
+              <w:start w:w="100" w:type="dxa"/>
+              <w:bottom w:w="90" w:type="dxa"/>
+              <w:end w:w="100" w:type="dxa"/>
+            </w:tcMar>
+            <w:shd w:fill="F3F7FA"/>
+          </w:tcPr>
+          <w:p>
+            <w:pPr>
+              <w:spacing w:after="0" w:line="240" w:lineRule="auto"/>
+            </w:pPr>
+            <w:r>
+              <w:rPr>
+                <w:b w:val="0"/>
+                <w:sz w:val="18"/>
+              </w:rPr>
+              <w:t>Deletes the selected folder, its child folders and their virtual links after confirmation. Media files remain.</w:t>
+            </w:r>
+          </w:p>
+        </w:tc>
+      </w:tr>
+      <w:tr>
+        <w:trPr>
+          <w:cantSplit w:val="true"/>
+        </w:trPr>
+        <w:tc>
+          <w:tcPr>
+            <w:tcW w:type="dxa" w:w="3024"/>
+            <w:vAlign w:val="center"/>
+            <w:tcMar>
+              <w:top w:w="90" w:type="dxa"/>
+              <w:start w:w="100" w:type="dxa"/>
+              <w:bottom w:w="90" w:type="dxa"/>
+              <w:end w:w="100" w:type="dxa"/>
+            </w:tcMar>
+          </w:tcPr>
+          <w:p>
+            <w:pPr>
+              <w:spacing w:after="0" w:line="240" w:lineRule="auto"/>
+            </w:pPr>
+            <w:r>
+              <w:rPr>
+                <w:b/>
+                <w:sz w:val="18"/>
+              </w:rPr>
+              <w:t>Folder count</w:t>
+            </w:r>
+          </w:p>
+        </w:tc>
+        <w:tc>
+          <w:tcPr>
+            <w:tcW w:type="dxa" w:w="7200"/>
+            <w:vAlign w:val="center"/>
+            <w:tcMar>
+              <w:top w:w="90" w:type="dxa"/>
+              <w:start w:w="100" w:type="dxa"/>
+              <w:bottom w:w="90" w:type="dxa"/>
+              <w:end w:w="100" w:type="dxa"/>
+            </w:tcMar>
+          </w:tcPr>
+          <w:p>
+            <w:pPr>
+              <w:spacing w:after="0" w:line="240" w:lineRule="auto"/>
+            </w:pPr>
+            <w:r>
+              <w:rPr>
+                <w:b w:val="0"/>
+                <w:sz w:val="18"/>
+              </w:rPr>
+              <w:t>Shows the number of directly linked tracks. The visible Karaoke or Music count can be lower when that media filter is active.</w:t>
+            </w:r>
+          </w:p>
+        </w:tc>
+      </w:tr>
+    </w:tbl>
+    <w:p>
+      <w:pPr>
+        <w:spacing w:after="20"/>
+      </w:pPr>
+    </w:p>
+    <w:p>
+      <w:pPr>
+        <w:pStyle w:val="Heading2"/>
+        <w:keepNext/>
+      </w:pPr>
+      <w:r>
+        <w:t>Import BPM Studio virtual folders</w:t>
+      </w:r>
+    </w:p>
+    <w:p>
+      <w:pPr>
+        <w:ind w:left="259" w:hanging="259"/>
+      </w:pPr>
+      <w:r>
+        <w:rPr>
+          <w:b/>
+          <w:color w:val="173A56"/>
+        </w:rPr>
+        <w:t xml:space="preserve">1. </w:t>
+      </w:r>
+      <w:r>
+        <w:t>Close BPM Studio so its archive files are stable.</w:t>
+      </w:r>
+    </w:p>
+    <w:p>
+      <w:pPr>
+        <w:ind w:left="259" w:hanging="259"/>
+      </w:pPr>
+      <w:r>
+        <w:rPr>
+          <w:b/>
+          <w:color w:val="173A56"/>
+        </w:rPr>
+        <w:t xml:space="preserve">2. </w:t>
+      </w:r>
+      <w:r>
+        <w:t>In Hazz choose Import, Import BPM Studio and select the BPM Studio data or archive folder.</w:t>
+      </w:r>
+    </w:p>
+    <w:p>
+      <w:pPr>
+        <w:ind w:left="259" w:hanging="259"/>
+      </w:pPr>
+      <w:r>
+        <w:rPr>
+          <w:b/>
+          <w:color w:val="173A56"/>
+        </w:rPr>
+        <w:t xml:space="preserve">3. </w:t>
+      </w:r>
+      <w:r>
+        <w:t>Review the preview counts and confirm the fast read-only import.</w:t>
+      </w:r>
+    </w:p>
+    <w:p>
+      <w:pPr>
+        <w:ind w:left="259" w:hanging="259"/>
+      </w:pPr>
+      <w:r>
+        <w:rPr>
+          <w:b/>
+          <w:color w:val="173A56"/>
+        </w:rPr>
+        <w:t xml:space="preserve">4. </w:t>
+      </w:r>
+      <w:r>
+        <w:t>Hazz imports playlists and history, reads recoverable .GRP and .PLG archive groups, and creates them below a BPM Studio virtual folder. Physical subdirectories become nested Hazz folders.</w:t>
+      </w:r>
+    </w:p>
+    <w:p>
+      <w:pPr>
+        <w:ind w:left="259" w:hanging="259"/>
+      </w:pPr>
+      <w:r>
+        <w:rPr>
+          <w:b/>
+          <w:color w:val="173A56"/>
+        </w:rPr>
+        <w:t xml:space="preserve">5. </w:t>
+      </w:r>
+      <w:r>
+        <w:t>Open Library, Browse Library and expand BPM Studio to check the imported groups. Unreadable proprietary group files are listed in the completion report; source data is never changed.</w:t>
+      </w:r>
+    </w:p>
+    <w:p>
+      <w:pPr>
+        <w:pStyle w:val="Heading2"/>
+        <w:keepNext/>
+      </w:pPr>
+      <w:r>
+        <w:t>Import VirtualDJ and other program folders</w:t>
+      </w:r>
+    </w:p>
+    <w:p>
+      <w:pPr>
+        <w:ind w:left="259" w:hanging="259"/>
+      </w:pPr>
+      <w:r>
+        <w:rPr>
+          <w:b/>
+          <w:color w:val="173A56"/>
+        </w:rPr>
+        <w:t xml:space="preserve">1. </w:t>
+      </w:r>
+      <w:r>
+        <w:t>Close the other program so its files are stable.</w:t>
+      </w:r>
+    </w:p>
+    <w:p>
+      <w:pPr>
+        <w:ind w:left="259" w:hanging="259"/>
+      </w:pPr>
+      <w:r>
+        <w:rPr>
+          <w:b/>
+          <w:color w:val="173A56"/>
+        </w:rPr>
+        <w:t xml:space="preserve">2. </w:t>
+      </w:r>
+      <w:r>
+        <w:t>Choose Import, Smart Import, Detect from Application Folder.</w:t>
+      </w:r>
+    </w:p>
+    <w:p>
+      <w:pPr>
+        <w:ind w:left="259" w:hanging="259"/>
+      </w:pPr>
+      <w:r>
+        <w:rPr>
+          <w:b/>
+          <w:color w:val="173A56"/>
+        </w:rPr>
+        <w:t xml:space="preserve">3. </w:t>
+      </w:r>
+      <w:r>
+        <w:t>Select the complete application data/export folder. For VirtualDJ, select the home folder containing database.xml plus MyLists or Playlists.</w:t>
+      </w:r>
+    </w:p>
+    <w:p>
+      <w:pPr>
+        <w:ind w:left="259" w:hanging="259"/>
+      </w:pPr>
+      <w:r>
+        <w:rPr>
+          <w:b/>
+          <w:color w:val="173A56"/>
+        </w:rPr>
+        <w:t xml:space="preserve">4. </w:t>
+      </w:r>
+      <w:r>
+        <w:t>Review the detected program and sample, then confirm the read-only import.</w:t>
+      </w:r>
+    </w:p>
+    <w:p>
+      <w:pPr>
+        <w:ind w:left="259" w:hanging="259"/>
+      </w:pPr>
+      <w:r>
+        <w:rPr>
+          <w:b/>
+          <w:color w:val="173A56"/>
+        </w:rPr>
+        <w:t xml:space="preserve">5. </w:t>
+      </w:r>
+      <w:r>
+        <w:t>Open Library, Browse Library and expand the folder named after the detected application. VirtualDJ My Lists, Rekordbox playlist trees and nested M3U, PLS, XSPF or WPL exports retain their folder structure.</w:t>
+      </w:r>
+    </w:p>
+    <w:p>
+      <w:pPr>
+        <w:pStyle w:val="Heading2"/>
+        <w:keepNext/>
+      </w:pPr>
+      <w:r>
+        <w:t>Virtual-folder examples</w:t>
+      </w:r>
+    </w:p>
+    <w:tbl>
+      <w:tblPr>
+        <w:tblW w:type="auto" w:w="0"/>
+        <w:jc w:val="center"/>
+        <w:tblLayout w:type="fixed"/>
+        <w:tblLook w:firstColumn="1" w:firstRow="1" w:lastColumn="0" w:lastRow="0" w:noHBand="0" w:noVBand="1" w:val="04A0"/>
+        <w:tblBorders>
+          <w:top w:val="single" w:sz="5" w:color="D9D9D9"/>
+          <w:left w:val="single" w:sz="5" w:color="D9D9D9"/>
+          <w:bottom w:val="single" w:sz="5" w:color="D9D9D9"/>
+          <w:right w:val="single" w:sz="5" w:color="D9D9D9"/>
+          <w:insideH w:val="single" w:sz="5" w:color="D9D9D9"/>
+          <w:insideV w:val="single" w:sz="5" w:color="D9D9D9"/>
+        </w:tblBorders>
+      </w:tblPr>
+      <w:tblGrid>
+        <w:gridCol w:w="5141"/>
+        <w:gridCol w:w="5141"/>
+      </w:tblGrid>
+      <w:tr>
+        <w:trPr>
+          <w:tblHeader w:val="true"/>
+        </w:trPr>
+        <w:tc>
+          <w:tcPr>
+            <w:tcW w:type="dxa" w:w="3024"/>
+            <w:shd w:fill="173A56"/>
+            <w:tcMar>
+              <w:top w:w="90" w:type="dxa"/>
+              <w:start w:w="100" w:type="dxa"/>
+              <w:bottom w:w="90" w:type="dxa"/>
+              <w:end w:w="100" w:type="dxa"/>
+            </w:tcMar>
+            <w:vAlign w:val="center"/>
+          </w:tcPr>
+          <w:p>
+            <w:r>
+              <w:rPr>
+                <w:b/>
+                <w:color w:val="FFFFFF"/>
+                <w:sz w:val="19"/>
+              </w:rPr>
+              <w:t>Control or function</w:t>
+            </w:r>
+          </w:p>
+        </w:tc>
+        <w:tc>
+          <w:tcPr>
+            <w:tcW w:type="dxa" w:w="7200"/>
+            <w:shd w:fill="173A56"/>
+            <w:tcMar>
+              <w:top w:w="90" w:type="dxa"/>
+              <w:start w:w="100" w:type="dxa"/>
+              <w:bottom w:w="90" w:type="dxa"/>
+              <w:end w:w="100" w:type="dxa"/>
+            </w:tcMar>
+            <w:vAlign w:val="center"/>
+          </w:tcPr>
+          <w:p>
+            <w:r>
+              <w:rPr>
+                <w:b/>
+                <w:color w:val="FFFFFF"/>
+                <w:sz w:val="19"/>
+              </w:rPr>
+              <w:t>What it does</w:t>
+            </w:r>
+          </w:p>
+        </w:tc>
+      </w:tr>
+      <w:tr>
+        <w:trPr>
+          <w:cantSplit w:val="true"/>
+        </w:trPr>
+        <w:tc>
+          <w:tcPr>
+            <w:tcW w:type="dxa" w:w="3024"/>
+            <w:vAlign w:val="center"/>
+            <w:tcMar>
+              <w:top w:w="90" w:type="dxa"/>
+              <w:start w:w="100" w:type="dxa"/>
+              <w:bottom w:w="90" w:type="dxa"/>
+              <w:end w:w="100" w:type="dxa"/>
+            </w:tcMar>
+          </w:tcPr>
+          <w:p>
+            <w:pPr>
+              <w:spacing w:after="0" w:line="240" w:lineRule="auto"/>
+            </w:pPr>
+            <w:r>
+              <w:rPr>
+                <w:b/>
+                <w:sz w:val="18"/>
+              </w:rPr>
+              <w:t>80s / Rock</w:t>
+            </w:r>
+          </w:p>
+        </w:tc>
+        <w:tc>
+          <w:tcPr>
+            <w:tcW w:type="dxa" w:w="7200"/>
+            <w:vAlign w:val="center"/>
+            <w:tcMar>
+              <w:top w:w="90" w:type="dxa"/>
+              <w:start w:w="100" w:type="dxa"/>
+              <w:bottom w:w="90" w:type="dxa"/>
+              <w:end w:w="100" w:type="dxa"/>
+            </w:tcMar>
+          </w:tcPr>
+          <w:p>
+            <w:pPr>
+              <w:spacing w:after="0" w:line="240" w:lineRule="auto"/>
+            </w:pPr>
+            <w:r>
+              <w:rPr>
+                <w:b w:val="0"/>
+                <w:sz w:val="18"/>
+              </w:rPr>
+              <w:t>Create 80s, select it, create Rock as a subfolder, then add the chosen tracks to 80s / Rock.</w:t>
+            </w:r>
+          </w:p>
+        </w:tc>
+      </w:tr>
+      <w:tr>
+        <w:trPr>
+          <w:cantSplit w:val="true"/>
+        </w:trPr>
+        <w:tc>
+          <w:tcPr>
+            <w:tcW w:type="dxa" w:w="3024"/>
+            <w:vAlign w:val="center"/>
+            <w:tcMar>
+              <w:top w:w="90" w:type="dxa"/>
+              <w:start w:w="100" w:type="dxa"/>
+              <w:bottom w:w="90" w:type="dxa"/>
+              <w:end w:w="100" w:type="dxa"/>
+            </w:tcMar>
+            <w:shd w:fill="F3F7FA"/>
+          </w:tcPr>
+          <w:p>
+            <w:pPr>
+              <w:spacing w:after="0" w:line="240" w:lineRule="auto"/>
+            </w:pPr>
+            <w:r>
+              <w:rPr>
+                <w:b/>
+                <w:sz w:val="18"/>
+              </w:rPr>
+              <w:t>Jingles / Station IDs</w:t>
+            </w:r>
+          </w:p>
+        </w:tc>
+        <w:tc>
+          <w:tcPr>
+            <w:tcW w:type="dxa" w:w="7200"/>
+            <w:vAlign w:val="center"/>
+            <w:tcMar>
+              <w:top w:w="90" w:type="dxa"/>
+              <w:start w:w="100" w:type="dxa"/>
+              <w:bottom w:w="90" w:type="dxa"/>
+              <w:end w:w="100" w:type="dxa"/>
+            </w:tcMar>
+            <w:shd w:fill="F3F7FA"/>
+          </w:tcPr>
+          <w:p>
+            <w:pPr>
+              <w:spacing w:after="0" w:line="240" w:lineRule="auto"/>
+            </w:pPr>
+            <w:r>
+              <w:rPr>
+                <w:b w:val="0"/>
+                <w:sz w:val="18"/>
+              </w:rPr>
+              <w:t>Keep short show elements separate from ordinary music while leaving the actual files in the original jingle folder.</w:t>
+            </w:r>
+          </w:p>
+        </w:tc>
+      </w:tr>
+      <w:tr>
+        <w:trPr>
+          <w:cantSplit w:val="true"/>
+        </w:trPr>
+        <w:tc>
+          <w:tcPr>
+            <w:tcW w:type="dxa" w:w="3024"/>
+            <w:vAlign w:val="center"/>
+            <w:tcMar>
+              <w:top w:w="90" w:type="dxa"/>
+              <w:start w:w="100" w:type="dxa"/>
+              <w:bottom w:w="90" w:type="dxa"/>
+              <w:end w:w="100" w:type="dxa"/>
+            </w:tcMar>
+          </w:tcPr>
+          <w:p>
+            <w:pPr>
+              <w:spacing w:after="0" w:line="240" w:lineRule="auto"/>
+            </w:pPr>
+            <w:r>
+              <w:rPr>
+                <w:b/>
+                <w:sz w:val="18"/>
+              </w:rPr>
+              <w:t>Party / Floor Fillers</w:t>
+            </w:r>
+          </w:p>
+        </w:tc>
+        <w:tc>
+          <w:tcPr>
+            <w:tcW w:type="dxa" w:w="7200"/>
+            <w:vAlign w:val="center"/>
+            <w:tcMar>
+              <w:top w:w="90" w:type="dxa"/>
+              <w:start w:w="100" w:type="dxa"/>
+              <w:bottom w:w="90" w:type="dxa"/>
+              <w:end w:w="100" w:type="dxa"/>
+            </w:tcMar>
+          </w:tcPr>
+          <w:p>
+            <w:pPr>
+              <w:spacing w:after="0" w:line="240" w:lineRule="auto"/>
+            </w:pPr>
+            <w:r>
+              <w:rPr>
+                <w:b w:val="0"/>
+                <w:sz w:val="18"/>
+              </w:rPr>
+              <w:t>Add a track here and also to 80s or Rock; Hazz stores separate links to the same library item.</w:t>
+            </w:r>
+          </w:p>
+        </w:tc>
+      </w:tr>
+      <w:tr>
+        <w:trPr>
+          <w:cantSplit w:val="true"/>
+        </w:trPr>
+        <w:tc>
+          <w:tcPr>
+            <w:tcW w:type="dxa" w:w="3024"/>
+            <w:vAlign w:val="center"/>
+            <w:tcMar>
+              <w:top w:w="90" w:type="dxa"/>
+              <w:start w:w="100" w:type="dxa"/>
+              <w:bottom w:w="90" w:type="dxa"/>
+              <w:end w:w="100" w:type="dxa"/>
+            </w:tcMar>
+            <w:shd w:fill="F3F7FA"/>
+          </w:tcPr>
+          <w:p>
+            <w:pPr>
+              <w:spacing w:after="0" w:line="240" w:lineRule="auto"/>
+            </w:pPr>
+            <w:r>
+              <w:rPr>
+                <w:b/>
+                <w:sz w:val="18"/>
+              </w:rPr>
+              <w:t>BPM Studio / …</w:t>
+            </w:r>
+          </w:p>
+        </w:tc>
+        <w:tc>
+          <w:tcPr>
+            <w:tcW w:type="dxa" w:w="7200"/>
+            <w:vAlign w:val="center"/>
+            <w:tcMar>
+              <w:top w:w="90" w:type="dxa"/>
+              <w:start w:w="100" w:type="dxa"/>
+              <w:bottom w:w="90" w:type="dxa"/>
+              <w:end w:w="100" w:type="dxa"/>
+            </w:tcMar>
+            <w:shd w:fill="F3F7FA"/>
+          </w:tcPr>
+          <w:p>
+            <w:pPr>
+              <w:spacing w:after="0" w:line="240" w:lineRule="auto"/>
+            </w:pPr>
+            <w:r>
+              <w:rPr>
+                <w:b w:val="0"/>
+                <w:sz w:val="18"/>
+              </w:rPr>
+              <w:t>Created by BPM Studio import from recoverable archive groups. You can browse and use these like folders created in Hazz.</w:t>
+            </w:r>
+          </w:p>
+        </w:tc>
+      </w:tr>
+    </w:tbl>
+    <w:p>
+      <w:pPr>
+        <w:spacing w:after="20"/>
+      </w:pPr>
+    </w:p>
+    <w:p>
+      <w:pPr>
+        <w:pStyle w:val="Heading2"/>
+        <w:keepNext/>
+      </w:pPr>
+      <w:r>
+        <w:t>Virtual-folder troubleshooting</w:t>
+      </w:r>
+    </w:p>
+    <w:p>
+      <w:pPr>
+        <w:pStyle w:val="ListBullet"/>
+      </w:pPr>
+      <w:r>
+        <w:t>If Hazz asks you to choose a folder, use Add Selected to Folder and select the destination in the picker.</w:t>
+      </w:r>
+    </w:p>
+    <w:p>
+      <w:pPr>
+        <w:pStyle w:val="ListBullet"/>
+      </w:pPr>
+      <w:r>
+        <w:t>If the folder is empty, confirm the correct Karaoke or Music tab is active and clear the search box.</w:t>
+      </w:r>
+    </w:p>
+    <w:p>
+      <w:pPr>
+        <w:pStyle w:val="ListBullet"/>
+      </w:pPr>
+      <w:r>
+        <w:t>If a parent appears empty, open its child folder; parent and child collections are deliberately separate.</w:t>
+      </w:r>
+    </w:p>
+    <w:p>
+      <w:pPr>
+        <w:pStyle w:val="ListBullet"/>
+      </w:pPr>
+      <w:r>
+        <w:t>If controls are clipped, maximise the Library Browser. v0.80 also changes the folder panel width for smaller displays.</w:t>
+      </w:r>
+    </w:p>
+    <w:p>
+      <w:pPr>
+        <w:pStyle w:val="ListBullet"/>
+      </w:pPr>
+      <w:r>
+        <w:t>If an imported BPM group is missing, check the completion report. Some proprietary group files contain no recoverable media paths.</w:t>
+      </w:r>
     </w:p>
     <w:p>
       <w:pPr>
@@ -13464,7 +14703,7 @@
         <w:t xml:space="preserve">3. </w:t>
       </w:r>
       <w:r>
-        <w:t>Add the video to a music deck and press Play.</w:t>
+        <w:t>Press Music Video at the top and search for the artist or title.</w:t>
       </w:r>
     </w:p>
     <w:p>
@@ -13479,7 +14718,7 @@
         <w:t xml:space="preserve">4. </w:t>
       </w:r>
       <w:r>
-        <w:t>Confirm its picture appears on Display 2 and only the deck audio is heard.</w:t>
+        <w:t>Add the video to a music deck and press Play, or press Space for quick play.</w:t>
       </w:r>
     </w:p>
     <w:p>
@@ -13492,6 +14731,21 @@
           <w:color w:val="173A56"/>
         </w:rPr>
         <w:t xml:space="preserve">5. </w:t>
+      </w:r>
+      <w:r>
+        <w:t>Confirm its picture appears on Display 2 with no singer lists or scrollers covering it.</w:t>
+      </w:r>
+    </w:p>
+    <w:p>
+      <w:pPr>
+        <w:ind w:left="259" w:hanging="259"/>
+      </w:pPr>
+      <w:r>
+        <w:rPr>
+          <w:b/>
+          <w:color w:val="173A56"/>
+        </w:rPr>
+        <w:t xml:space="preserve">6. </w:t>
       </w:r>
       <w:r>
         <w:t>Use Pause, seek and Stop normally. Karaoke automatically replaces it when a singer begins.</w:t>
@@ -13515,7 +14769,7 @@
         <w:drawing>
           <wp:inline xmlns:a="http://schemas.openxmlformats.org/drawingml/2006/main" xmlns:pic="http://schemas.openxmlformats.org/drawingml/2006/picture">
             <wp:extent cx="6400800" cy="1040130"/>
-            <wp:docPr id="14" name="Picture 14"/>
+            <wp:docPr id="15" name="Picture 15"/>
             <wp:cNvGraphicFramePr>
               <a:graphicFrameLocks noChangeAspect="1"/>
             </wp:cNvGraphicFramePr>
@@ -13527,7 +14781,7 @@
                     <pic:cNvPicPr/>
                   </pic:nvPicPr>
                   <pic:blipFill>
-                    <a:blip r:embed="rId23"/>
+                    <a:blip r:embed="rId24"/>
                     <a:stretch>
                       <a:fillRect/>
                     </a:stretch>
@@ -13813,7 +15067,7 @@
                 <w:b/>
                 <w:sz w:val="18"/>
               </w:rPr>
-              <w:t>Space in Music search</w:t>
+              <w:t>Space in Music or Music Video search</w:t>
             </w:r>
           </w:p>
         </w:tc>
@@ -15257,7 +16511,7 @@
         <w:pStyle w:val="ListBullet"/>
       </w:pPr>
       <w:r>
-        <w:t>Confirm the file version is 0.17.22.0.</w:t>
+        <w:t>Confirm the file version is 0.80.0.0.</w:t>
       </w:r>
     </w:p>
     <w:p>
@@ -15751,6 +17005,74 @@
         <w:t>Keep this checklist near the host computer until the setup and shutdown sequence becomes routine.</w:t>
       </w:r>
     </w:p>
+    <w:p>
+      <w:r>
+        <w:br w:type="page"/>
+      </w:r>
+    </w:p>
+    <w:p>
+      <w:pPr>
+        <w:pStyle w:val="Heading1"/>
+      </w:pPr>
+      <w:r>
+        <w:t>BPM Studio large archive import</w:t>
+      </w:r>
+    </w:p>
+    <w:p>
+      <w:r>
+        <w:t>Version 0.80 improves the dedicated BPM Studio importer for very large libraries. BPM source files remain read-only, and the import window shows the work that remains.</w:t>
+      </w:r>
+    </w:p>
+    <w:p>
+      <w:pPr>
+        <w:pStyle w:val="Heading2"/>
+      </w:pPr>
+      <w:r>
+        <w:t>Duplicate and repeat group files</w:t>
+      </w:r>
+    </w:p>
+    <w:p>
+      <w:pPr>
+        <w:pStyle w:val="ListNumber"/>
+      </w:pPr>
+      <w:r>
+        <w:t>Select the BPM Studio data or archive folder once. Hazz searches it recursively for supported playlist, history, GRP and PLG files.</w:t>
+      </w:r>
+    </w:p>
+    <w:p>
+      <w:pPr>
+        <w:pStyle w:val="ListNumber"/>
+      </w:pPr>
+      <w:r>
+        <w:t>When several GRP or PLG files have the same filename, Hazz imports only the newest modified copy. If dates match, the larger copy is selected.</w:t>
+      </w:r>
+    </w:p>
+    <w:p>
+      <w:pPr>
+        <w:pStyle w:val="ListNumber"/>
+      </w:pPr>
+      <w:r>
+        <w:t>Hazz remembers a processed group by its full path, size and modified time. Repeat imports skip unchanged groups and read changed groups again.</w:t>
+      </w:r>
+    </w:p>
+    <w:p>
+      <w:pPr>
+        <w:pStyle w:val="Heading2"/>
+      </w:pPr>
+      <w:r>
+        <w:t>Large import progress</w:t>
+      </w:r>
+    </w:p>
+    <w:p>
+      <w:r>
+        <w:t>The progress window moves through Reading, Indexing, Linking, Saving and Finalizing database. Song search data is indexed in bounded batches, and virtual-folder links are saved in 5,000-track batches. Wait for Import complete before starting another import or closing Hazz.</w:t>
+      </w:r>
+    </w:p>
+    <w:p>
+      <w:r>
+        <w:t>Cancel requests are checked between batches. If cancellation is requested during a database operation, allow Hazz to finish the current safe unit and roll back the unfinished transaction.</w:t>
+      </w:r>
+    </w:p>
     <w:sectPr>
       <w:headerReference w:type="default" r:id="rId9"/>
       <w:footerReference w:type="default" r:id="rId10"/>
@@ -15795,7 +17117,7 @@
         <w:color w:val="4A5966"/>
         <w:sz w:val="17"/>
       </w:rPr>
-      <w:t>Hazz Karaoke Hoster Complete Illustrated User Manual  |  v0.17.22</w:t>
+      <w:t>Hazz Karaoke Hoster Complete Illustrated User Manual  |  v0.80</w:t>
     </w:r>
   </w:p>
 </w:hdr>

</xml_diff>